<commit_message>
Add on-axis PSF sweep and correct focused transmit delay
- Correct the focused DAS transmit path; update focused B-mode, point-target, contrast, and SNR results
- Add a per-depth axial single-scatterer sweep for F10 and cache deterministic products
- Report absolute SNR, refine F14 field coverage with subsampled field maps, and use -6 dB resolution widths
- Restructure the report and regenerate documentation, tables, and figures
- Ignore temporary diagnostic directories
</commit_message>
<xml_diff>
--- a/docs/实验设计方案.docx
+++ b/docs/实验设计方案.docx
@@ -1168,7 +1168,7 @@
         <w:rPr>
           <w:rFonts w:hint="eastAsia"/>
         </w:rPr>
-        <w:t xml:space="preserve">三种方法在同一体模、同一噪声水平下比较：−10</w:t>
+        <w:t xml:space="preserve">三种方法在同一体模、同一噪声水平下比较：−6</w:t>
       </w:r>
       <w:r>
         <w:t xml:space="preserve"> dB </w:t>
@@ -12026,16 +12026,7 @@
               <w:rPr>
                 <w:rFonts w:hint="eastAsia"/>
               </w:rPr>
-              <w:t xml:space="preserve">相对</w:t>
-            </w:r>
-            <w:r>
-              <w:t xml:space="preserve"> </w:t>
-            </w:r>
-            <w:r>
-              <w:rPr>
-                <w:rFonts w:hint="eastAsia"/>
-              </w:rPr>
-              <w:t xml:space="preserve">SNR（各方法相除）不受影响；绝对</w:t>
+              <w:t xml:space="preserve">方法之间的</w:t>
             </w:r>
             <w:r>
               <w:t xml:space="preserve"> SNR </w:t>
@@ -12044,7 +12035,16 @@
               <w:rPr>
                 <w:rFonts w:hint="eastAsia"/>
               </w:rPr>
-              <w:t xml:space="preserve">不可直接比较</w:t>
+              <w:t xml:space="preserve">差值不受影响；绝对</w:t>
+            </w:r>
+            <w:r>
+              <w:t xml:space="preserve"> SNR </w:t>
+            </w:r>
+            <w:r>
+              <w:rPr>
+                <w:rFonts w:hint="eastAsia"/>
+              </w:rPr>
+              <w:t xml:space="preserve">与临床不可直接比较</w:t>
             </w:r>
           </w:p>
         </w:tc>
@@ -12869,7 +12869,7 @@
         <w:t xml:space="preserve">后点目标是否聚焦在</w:t>
       </w:r>
       <w:r>
-        <w:t xml:space="preserve"> 30 mm、−10 dB </w:t>
+        <w:t xml:space="preserve"> 30 mm、−6 dB </w:t>
       </w:r>
       <w:r>
         <w:rPr>
@@ -12878,7 +12878,7 @@
         <w:t xml:space="preserve">横向宽度是否在</w:t>
       </w:r>
       <w:r>
-        <w:t xml:space="preserve"> 1.6–2.0 mm </w:t>
+        <w:t xml:space="preserve"> 0.7–1.0 mm </w:t>
       </w:r>
       <w:r>
         <w:rPr>
@@ -13209,7 +13209,28 @@
         <w:rPr>
           <w:rFonts w:hint="eastAsia"/>
         </w:rPr>
-        <w:t xml:space="preserve">7：</w:t>
+        <w:t xml:space="preserve">7（</w:t>
+      </w:r>
+      <w:r>
+        <w:rPr>
+          <w:rFonts w:hint="eastAsia"/>
+          <w:b/>
+          <w:bCs/>
+        </w:rPr>
+        <w:t xml:space="preserve">发射路程已修正，见归档</w:t>
+      </w:r>
+      <w:r>
+        <w:rPr>
+          <w:b/>
+          <w:bCs/>
+        </w:rPr>
+        <w:t xml:space="preserve"> B20</w:t>
+      </w:r>
+      <w:r>
+        <w:rPr>
+          <w:rFonts w:hint="eastAsia"/>
+        </w:rPr>
+        <w:t xml:space="preserve">）：</w:t>
       </w:r>
     </w:p>
     <w:p>
@@ -13287,7 +13308,58 @@
             </m:fPr>
             <m:num>
               <m:r>
+                <m:rPr>
+                  <m:sty m:val="p"/>
+                </m:rPr>
+                <m:t>|</m:t>
+              </m:r>
+              <m:r>
+                <m:t>F</m:t>
+              </m:r>
+              <m:r>
+                <m:rPr>
+                  <m:sty m:val="p"/>
+                </m:rPr>
+                <m:t>|</m:t>
+              </m:r>
+              <m:r>
+                <m:rPr>
+                  <m:sty m:val="p"/>
+                </m:rPr>
+                <m:t>+</m:t>
+              </m:r>
+              <m:r>
+                <m:rPr>
+                  <m:sty m:val="p"/>
+                </m:rPr>
+                <m:t>(</m:t>
+              </m:r>
+              <m:r>
                 <m:t>z</m:t>
+              </m:r>
+              <m:r>
+                <m:rPr>
+                  <m:sty m:val="p"/>
+                </m:rPr>
+                <m:t>−</m:t>
+              </m:r>
+              <m:sSub>
+                <m:e>
+                  <m:r>
+                    <m:t>z</m:t>
+                  </m:r>
+                </m:e>
+                <m:sub>
+                  <m:r>
+                    <m:t>f</m:t>
+                  </m:r>
+                </m:sub>
+              </m:sSub>
+              <m:r>
+                <m:rPr>
+                  <m:sty m:val="p"/>
+                </m:rPr>
+                <m:t>)</m:t>
               </m:r>
               <m:r>
                 <m:rPr>
@@ -13383,10 +13455,509 @@
             <m:rPr>
               <m:sty m:val="p"/>
             </m:rPr>
-            <m:t>.</m:t>
+            <m:t>+</m:t>
+          </m:r>
+          <m:f>
+            <m:fPr>
+              <m:type m:val="bar"/>
+            </m:fPr>
+            <m:num>
+              <m:r>
+                <m:rPr>
+                  <m:sty m:val="p"/>
+                </m:rPr>
+                <m:t>|</m:t>
+              </m:r>
+              <m:r>
+                <m:t>F</m:t>
+              </m:r>
+              <m:r>
+                <m:rPr>
+                  <m:sty m:val="p"/>
+                </m:rPr>
+                <m:t>|</m:t>
+              </m:r>
+              <m:r>
+                <m:rPr>
+                  <m:sty m:val="p"/>
+                </m:rPr>
+                <m:t>−</m:t>
+              </m:r>
+              <m:r>
+                <m:rPr>
+                  <m:sty m:val="p"/>
+                </m:rPr>
+                <m:t>|</m:t>
+              </m:r>
+              <m:r>
+                <m:t>F</m:t>
+              </m:r>
+              <m:r>
+                <m:rPr>
+                  <m:sty m:val="p"/>
+                </m:rPr>
+                <m:t>−</m:t>
+              </m:r>
+              <m:sSub>
+                <m:e>
+                  <m:r>
+                    <m:t>x</m:t>
+                  </m:r>
+                </m:e>
+                <m:sub>
+                  <m:r>
+                    <m:t>1</m:t>
+                  </m:r>
+                </m:sub>
+              </m:sSub>
+              <m:r>
+                <m:rPr>
+                  <m:sty m:val="p"/>
+                </m:rPr>
+                <m:t>|</m:t>
+              </m:r>
+            </m:num>
+            <m:den>
+              <m:r>
+                <m:t>c</m:t>
+              </m:r>
+            </m:den>
+          </m:f>
+          <m:r>
+            <m:rPr>
+              <m:sty m:val="p"/>
+            </m:rPr>
+            <m:t>,</m:t>
           </m:r>
         </m:oMath>
       </m:oMathPara>
+    </w:p>
+    <w:p>
+      <w:pPr>
+        <w:pStyle w:val="Compact"/>
+        <w:numPr>
+          <w:ilvl w:val="0"/>
+          <w:numId w:val="1000"/>
+        </w:numPr>
+      </w:pPr>
+      <w:r>
+        <w:rPr>
+          <w:rFonts w:hint="eastAsia"/>
+        </w:rPr>
+        <w:t xml:space="preserve">其中</w:t>
+      </w:r>
+      <w:r>
+        <w:t xml:space="preserve"> </w:t>
+      </w:r>
+      <m:oMath>
+        <m:r>
+          <m:t>F</m:t>
+        </m:r>
+        <m:r>
+          <m:rPr>
+            <m:sty m:val="p"/>
+          </m:rPr>
+          <m:t>=</m:t>
+        </m:r>
+        <m:r>
+          <m:rPr>
+            <m:sty m:val="p"/>
+          </m:rPr>
+          <m:t>(</m:t>
+        </m:r>
+        <m:sSub>
+          <m:e>
+            <m:r>
+              <m:t>x</m:t>
+            </m:r>
+          </m:e>
+          <m:sub>
+            <m:r>
+              <m:t>f</m:t>
+            </m:r>
+          </m:sub>
+        </m:sSub>
+        <m:r>
+          <m:rPr>
+            <m:sty m:val="p"/>
+          </m:rPr>
+          <m:t>,</m:t>
+        </m:r>
+        <m:r>
+          <m:t>0</m:t>
+        </m:r>
+        <m:r>
+          <m:rPr>
+            <m:sty m:val="p"/>
+          </m:rPr>
+          <m:t>,</m:t>
+        </m:r>
+        <m:sSub>
+          <m:e>
+            <m:r>
+              <m:t>z</m:t>
+            </m:r>
+          </m:e>
+          <m:sub>
+            <m:r>
+              <m:t>f</m:t>
+            </m:r>
+          </m:sub>
+        </m:sSub>
+        <m:r>
+          <m:rPr>
+            <m:sty m:val="p"/>
+          </m:rPr>
+          <m:t>)</m:t>
+        </m:r>
+      </m:oMath>
+      <w:r>
+        <w:t xml:space="preserve"> </w:t>
+      </w:r>
+      <w:r>
+        <w:rPr>
+          <w:rFonts w:hint="eastAsia"/>
+        </w:rPr>
+        <w:t xml:space="preserve">为焦点、</w:t>
+      </w:r>
+      <m:oMath>
+        <m:sSub>
+          <m:e>
+            <m:r>
+              <m:t>z</m:t>
+            </m:r>
+          </m:e>
+          <m:sub>
+            <m:r>
+              <m:t>f</m:t>
+            </m:r>
+          </m:sub>
+        </m:sSub>
+        <m:r>
+          <m:rPr>
+            <m:sty m:val="p"/>
+          </m:rPr>
+          <m:t>=</m:t>
+        </m:r>
+        <m:r>
+          <m:t>30</m:t>
+        </m:r>
+      </m:oMath>
+      <w:r>
+        <w:t xml:space="preserve"> </w:t>
+      </w:r>
+      <w:r>
+        <w:t xml:space="preserve">mm、</w:t>
+      </w:r>
+      <m:oMath>
+        <m:r>
+          <m:rPr>
+            <m:sty m:val="p"/>
+          </m:rPr>
+          <m:t>|</m:t>
+        </m:r>
+        <m:r>
+          <m:t>F</m:t>
+        </m:r>
+        <m:r>
+          <m:rPr>
+            <m:sty m:val="p"/>
+          </m:rPr>
+          <m:t>|</m:t>
+        </m:r>
+        <m:r>
+          <m:rPr>
+            <m:sty m:val="p"/>
+          </m:rPr>
+          <m:t>=</m:t>
+        </m:r>
+        <m:rad>
+          <m:radPr>
+            <m:degHide m:val="on"/>
+          </m:radPr>
+          <m:deg/>
+          <m:e>
+            <m:sSubSup>
+              <m:e>
+                <m:r>
+                  <m:t>x</m:t>
+                </m:r>
+              </m:e>
+              <m:sub>
+                <m:r>
+                  <m:t>f</m:t>
+                </m:r>
+              </m:sub>
+              <m:sup>
+                <m:r>
+                  <m:t>2</m:t>
+                </m:r>
+              </m:sup>
+            </m:sSubSup>
+            <m:r>
+              <m:rPr>
+                <m:sty m:val="p"/>
+              </m:rPr>
+              <m:t>+</m:t>
+            </m:r>
+            <m:sSubSup>
+              <m:e>
+                <m:r>
+                  <m:t>z</m:t>
+                </m:r>
+              </m:e>
+              <m:sub>
+                <m:r>
+                  <m:t>f</m:t>
+                </m:r>
+              </m:sub>
+              <m:sup>
+                <m:r>
+                  <m:t>2</m:t>
+                </m:r>
+              </m:sup>
+            </m:sSubSup>
+          </m:e>
+        </m:rad>
+      </m:oMath>
+      <w:r>
+        <w:rPr>
+          <w:rFonts w:hint="eastAsia"/>
+        </w:rPr>
+        <w:t xml:space="preserve">；最后一项是</w:t>
+      </w:r>
+      <w:r>
+        <w:t xml:space="preserve"> Field II</w:t>
+      </w:r>
+      <w:r>
+        <w:t xml:space="preserve"> </w:t>
+      </w:r>
+      <w:r>
+        <w:rPr>
+          <w:rFonts w:hint="eastAsia"/>
+        </w:rPr>
+        <w:t xml:space="preserve">把发射延时写进通道时间轴所要求的补偿（报告</w:t>
+      </w:r>
+      <w:r>
+        <w:t xml:space="preserve"> </w:t>
+      </w:r>
+      <w:r>
+        <w:rPr>
+          <w:rFonts w:hint="eastAsia"/>
+        </w:rPr>
+        <w:t xml:space="preserve">6.1）。原式把发射路程写作</w:t>
+      </w:r>
+      <w:r>
+        <w:t xml:space="preserve"> </w:t>
+      </w:r>
+      <m:oMath>
+        <m:r>
+          <m:t>z</m:t>
+        </m:r>
+      </m:oMath>
+      <w:r>
+        <w:rPr>
+          <w:rFonts w:hint="eastAsia"/>
+        </w:rPr>
+        <w:t xml:space="preserve">，只在</w:t>
+      </w:r>
+      <w:r>
+        <w:t xml:space="preserve"> </w:t>
+      </w:r>
+      <m:oMath>
+        <m:sSub>
+          <m:e>
+            <m:r>
+              <m:t>x</m:t>
+            </m:r>
+          </m:e>
+          <m:sub>
+            <m:r>
+              <m:t>f</m:t>
+            </m:r>
+          </m:sub>
+        </m:sSub>
+        <m:r>
+          <m:rPr>
+            <m:sty m:val="p"/>
+          </m:rPr>
+          <m:t>=</m:t>
+        </m:r>
+        <m:r>
+          <m:t>0</m:t>
+        </m:r>
+      </m:oMath>
+      <w:r>
+        <w:t xml:space="preserve"> </w:t>
+      </w:r>
+      <w:r>
+        <w:rPr>
+          <w:rFonts w:hint="eastAsia"/>
+        </w:rPr>
+        <w:t xml:space="preserve">的线上与</w:t>
+      </w:r>
+      <w:r>
+        <w:t xml:space="preserve"> </w:t>
+      </w:r>
+      <m:oMath>
+        <m:r>
+          <m:rPr>
+            <m:sty m:val="p"/>
+          </m:rPr>
+          <m:t>|</m:t>
+        </m:r>
+        <m:r>
+          <m:t>F</m:t>
+        </m:r>
+        <m:r>
+          <m:rPr>
+            <m:sty m:val="p"/>
+          </m:rPr>
+          <m:t>|</m:t>
+        </m:r>
+      </m:oMath>
+      <w:r>
+        <w:t xml:space="preserve"> </w:t>
+      </w:r>
+      <w:r>
+        <w:rPr>
+          <w:rFonts w:hint="eastAsia"/>
+        </w:rPr>
+        <w:t xml:space="preserve">相等；离轴线上整幅图会偏深</w:t>
+      </w:r>
+      <w:r>
+        <w:t xml:space="preserve"> </w:t>
+      </w:r>
+      <m:oMath>
+        <m:r>
+          <m:rPr>
+            <m:sty m:val="p"/>
+          </m:rPr>
+          <m:t>(</m:t>
+        </m:r>
+        <m:r>
+          <m:rPr>
+            <m:sty m:val="p"/>
+          </m:rPr>
+          <m:t>|</m:t>
+        </m:r>
+        <m:r>
+          <m:t>F</m:t>
+        </m:r>
+        <m:r>
+          <m:rPr>
+            <m:sty m:val="p"/>
+          </m:rPr>
+          <m:t>|</m:t>
+        </m:r>
+        <m:r>
+          <m:rPr>
+            <m:sty m:val="p"/>
+          </m:rPr>
+          <m:t>−</m:t>
+        </m:r>
+        <m:sSub>
+          <m:e>
+            <m:r>
+              <m:t>z</m:t>
+            </m:r>
+          </m:e>
+          <m:sub>
+            <m:r>
+              <m:t>f</m:t>
+            </m:r>
+          </m:sub>
+        </m:sSub>
+        <m:r>
+          <m:rPr>
+            <m:sty m:val="p"/>
+          </m:rPr>
+          <m:t>)</m:t>
+        </m:r>
+        <m:r>
+          <m:rPr>
+            <m:sty m:val="p"/>
+          </m:rPr>
+          <m:t>/</m:t>
+        </m:r>
+        <m:r>
+          <m:t>2</m:t>
+        </m:r>
+      </m:oMath>
+      <w:r>
+        <w:t xml:space="preserve"> </w:t>
+      </w:r>
+      <w:r>
+        <w:rPr>
+          <w:rFonts w:hint="eastAsia"/>
+        </w:rPr>
+        <w:t xml:space="preserve">（</w:t>
+      </w:r>
+      <m:oMath>
+        <m:r>
+          <m:rPr>
+            <m:sty m:val="p"/>
+          </m:rPr>
+          <m:t>|</m:t>
+        </m:r>
+        <m:sSub>
+          <m:e>
+            <m:r>
+              <m:t>x</m:t>
+            </m:r>
+          </m:e>
+          <m:sub>
+            <m:r>
+              <m:t>f</m:t>
+            </m:r>
+          </m:sub>
+        </m:sSub>
+        <m:r>
+          <m:rPr>
+            <m:sty m:val="p"/>
+          </m:rPr>
+          <m:t>|</m:t>
+        </m:r>
+        <m:r>
+          <m:rPr>
+            <m:sty m:val="p"/>
+          </m:rPr>
+          <m:t>=</m:t>
+        </m:r>
+        <m:r>
+          <m:t>12</m:t>
+        </m:r>
+      </m:oMath>
+      <w:r>
+        <w:t xml:space="preserve"> </w:t>
+      </w:r>
+      <w:r>
+        <w:t xml:space="preserve">mm </w:t>
+      </w:r>
+      <w:r>
+        <w:rPr>
+          <w:rFonts w:hint="eastAsia"/>
+        </w:rPr>
+        <w:t xml:space="preserve">时</w:t>
+      </w:r>
+      <w:r>
+        <w:t xml:space="preserve"> 1.16 </w:t>
+      </w:r>
+      <w:r>
+        <w:rPr>
+          <w:rFonts w:hint="eastAsia"/>
+        </w:rPr>
+        <w:t xml:space="preserve">mm），实测与影响见报告</w:t>
+      </w:r>
+      <w:r>
+        <w:t xml:space="preserve"> 5.6/5.9 </w:t>
+      </w:r>
+      <w:r>
+        <w:rPr>
+          <w:rFonts w:hint="eastAsia"/>
+        </w:rPr>
+        <w:t xml:space="preserve">节。</w:t>
+      </w:r>
     </w:p>
     <w:p>
       <w:pPr>
@@ -13659,7 +14230,7 @@
         <w:t xml:space="preserve">在</w:t>
       </w:r>
       <w:r>
-        <w:t xml:space="preserve"> 1 mm </w:t>
+        <w:t xml:space="preserve"> 0.5 mm </w:t>
       </w:r>
       <w:r>
         <w:rPr>
@@ -13729,7 +14300,25 @@
         <w:rPr>
           <w:rFonts w:hint="eastAsia"/>
         </w:rPr>
-        <w:t xml:space="preserve">）计算峰值声压；给出轴向/横向剖面。</w:t>
+        <w:t xml:space="preserve">，每点</w:t>
+      </w:r>
+      <w:r>
+        <w:t xml:space="preserve"> 5 </w:t>
+      </w:r>
+      <w:r>
+        <w:rPr>
+          <w:rFonts w:hint="eastAsia"/>
+        </w:rPr>
+        <w:t xml:space="preserve">个亚样本取平均，见附录</w:t>
+      </w:r>
+      <w:r>
+        <w:t xml:space="preserve"> </w:t>
+      </w:r>
+      <w:r>
+        <w:rPr>
+          <w:rFonts w:hint="eastAsia"/>
+        </w:rPr>
+        <w:t xml:space="preserve">B22）计算峰值声压；给出轴向/横向剖面。</w:t>
       </w:r>
     </w:p>
     <w:p>
@@ -13753,34 +14342,78 @@
         <w:rPr>
           <w:rFonts w:hint="eastAsia"/>
         </w:rPr>
-        <w:t xml:space="preserve">RF：显示</w:t>
-      </w:r>
-      <w:r>
-        <w:t xml:space="preserve"> 128 </w:t>
-      </w:r>
-      <w:r>
-        <w:rPr>
-          <w:rFonts w:hint="eastAsia"/>
-        </w:rPr>
-        <w:t xml:space="preserve">通道</w:t>
-      </w:r>
-      <w:r>
-        <w:t xml:space="preserve"> × </w:t>
-      </w:r>
-      <w:r>
-        <w:rPr>
-          <w:rFonts w:hint="eastAsia"/>
-        </w:rPr>
-        <w:t xml:space="preserve">时间；取</w:t>
-      </w:r>
-      <w:r>
-        <w:t xml:space="preserve"> 3 </w:t>
-      </w:r>
-      <w:r>
-        <w:rPr>
-          <w:rFonts w:hint="eastAsia"/>
-        </w:rPr>
-        <w:t xml:space="preserve">条通道波形；放大一个点目标的双曲线到达。</w:t>
+        <w:t xml:space="preserve">RF：128</w:t>
+      </w:r>
+      <w:r>
+        <w:t xml:space="preserve"> </w:t>
+      </w:r>
+      <w:r>
+        <w:rPr>
+          <w:rFonts w:hint="eastAsia"/>
+        </w:rPr>
+        <w:t xml:space="preserve">通道的接收射频幅度，横轴阵元位置、纵轴往返深度</w:t>
+      </w:r>
+      <w:r>
+        <w:t xml:space="preserve"> </w:t>
+      </w:r>
+      <m:oMath>
+        <m:r>
+          <m:t>z</m:t>
+        </m:r>
+        <m:r>
+          <m:rPr>
+            <m:sty m:val="p"/>
+          </m:rPr>
+          <m:t>=</m:t>
+        </m:r>
+        <m:r>
+          <m:t>c</m:t>
+        </m:r>
+        <m:r>
+          <m:t>t</m:t>
+        </m:r>
+        <m:r>
+          <m:rPr>
+            <m:sty m:val="p"/>
+          </m:rPr>
+          <m:t>/</m:t>
+        </m:r>
+        <m:r>
+          <m:t>2</m:t>
+        </m:r>
+      </m:oMath>
+      <w:r>
+        <w:rPr>
+          <w:rFonts w:hint="eastAsia"/>
+        </w:rPr>
+        <w:t xml:space="preserve">（换能器在上），再与同一组数据的单角度成像、11</w:t>
+      </w:r>
+      <w:r>
+        <w:t xml:space="preserve"> </w:t>
+      </w:r>
+      <w:r>
+        <w:rPr>
+          <w:rFonts w:hint="eastAsia"/>
+        </w:rPr>
+        <w:t xml:space="preserve">角度复合结果三幅并排对照（实施见报告</w:t>
+      </w:r>
+      <w:r>
+        <w:t xml:space="preserve"> 5.2 </w:t>
+      </w:r>
+      <w:r>
+        <w:rPr>
+          <w:rFonts w:hint="eastAsia"/>
+        </w:rPr>
+        <w:t xml:space="preserve">的图</w:t>
+      </w:r>
+      <w:r>
+        <w:t xml:space="preserve"> </w:t>
+      </w:r>
+      <w:r>
+        <w:rPr>
+          <w:rFonts w:hint="eastAsia"/>
+        </w:rPr>
+        <w:t xml:space="preserve">F6）。</w:t>
       </w:r>
     </w:p>
     <w:p>
@@ -14128,7 +14761,7 @@
         <w:rPr>
           <w:rFonts w:hint="eastAsia"/>
         </w:rPr>
-        <w:t xml:space="preserve">计算峰值声压图（1</w:t>
+        <w:t xml:space="preserve">计算峰值声压图（0.5</w:t>
       </w:r>
       <w:r>
         <w:t xml:space="preserve"> mm </w:t>
@@ -14619,7 +15252,133 @@
         <w:rPr>
           <w:rFonts w:hint="eastAsia"/>
         </w:rPr>
-        <w:t xml:space="preserve">分辨率–深度：用</w:t>
+        <w:t xml:space="preserve">分辨率–深度：在</w:t>
+      </w:r>
+      <w:r>
+        <w:t xml:space="preserve"> </w:t>
+      </w:r>
+      <m:oMath>
+        <m:r>
+          <m:t>x</m:t>
+        </m:r>
+        <m:r>
+          <m:rPr>
+            <m:sty m:val="p"/>
+          </m:rPr>
+          <m:t>=</m:t>
+        </m:r>
+        <m:r>
+          <m:t>0</m:t>
+        </m:r>
+      </m:oMath>
+      <w:r>
+        <w:t xml:space="preserve"> </w:t>
+      </w:r>
+      <w:r>
+        <w:rPr>
+          <w:rFonts w:hint="eastAsia"/>
+        </w:rPr>
+        <w:t xml:space="preserve">上每</w:t>
+      </w:r>
+      <w:r>
+        <w:t xml:space="preserve"> 2 mm </w:t>
+      </w:r>
+      <w:r>
+        <w:rPr>
+          <w:rFonts w:hint="eastAsia"/>
+        </w:rPr>
+        <w:t xml:space="preserve">放</w:t>
+      </w:r>
+      <w:r>
+        <w:rPr>
+          <w:rFonts w:hint="eastAsia"/>
+          <w:b/>
+          <w:bCs/>
+        </w:rPr>
+        <w:t xml:space="preserve">一个</w:t>
+      </w:r>
+      <w:r>
+        <w:rPr>
+          <w:rFonts w:hint="eastAsia"/>
+        </w:rPr>
+        <w:t xml:space="preserve">散射子（</w:t>
+      </w:r>
+      <m:oMath>
+        <m:r>
+          <m:t>z</m:t>
+        </m:r>
+        <m:r>
+          <m:rPr>
+            <m:sty m:val="p"/>
+          </m:rPr>
+          <m:t>=</m:t>
+        </m:r>
+        <m:r>
+          <m:t>10</m:t>
+        </m:r>
+      </m:oMath>
+      <w:r>
+        <w:t xml:space="preserve">–60 </w:t>
+      </w:r>
+      <w:r>
+        <w:rPr>
+          <w:rFonts w:hint="eastAsia"/>
+        </w:rPr>
+        <w:t xml:space="preserve">mm，共</w:t>
+      </w:r>
+      <w:r>
+        <w:t xml:space="preserve"> 26 </w:t>
+      </w:r>
+      <w:r>
+        <w:rPr>
+          <w:rFonts w:hint="eastAsia"/>
+        </w:rPr>
+        <w:t xml:space="preserve">个），一次只放一个、放一个扫一遍，三种方法各测一条</w:t>
+      </w:r>
+      <w:r>
+        <w:t xml:space="preserve"> −6 dB </w:t>
+      </w:r>
+      <w:r>
+        <w:rPr>
+          <w:rFonts w:hint="eastAsia"/>
+        </w:rPr>
+        <w:t xml:space="preserve">横向宽度曲线（图</w:t>
+      </w:r>
+      <w:r>
+        <w:t xml:space="preserve"> </w:t>
+      </w:r>
+      <w:r>
+        <w:rPr>
+          <w:rFonts w:hint="eastAsia"/>
+        </w:rPr>
+        <w:t xml:space="preserve">F10）。聚焦另按</w:t>
+      </w:r>
+      <w:r>
+        <w:t xml:space="preserve"> 0.5 mm </w:t>
+      </w:r>
+      <w:r>
+        <w:rPr>
+          <w:rFonts w:hint="eastAsia"/>
+        </w:rPr>
+        <w:t xml:space="preserve">的间隔再放一遍散射子（101</w:t>
+      </w:r>
+      <w:r>
+        <w:t xml:space="preserve"> </w:t>
+      </w:r>
+      <w:r>
+        <w:rPr>
+          <w:rFonts w:hint="eastAsia"/>
+        </w:rPr>
+        <w:t xml:space="preserve">个深度，每个深度各放一个、各自成像，不是插值），用来分辨焦区约</w:t>
+      </w:r>
+      <w:r>
+        <w:t xml:space="preserve"> 1.8 mm </w:t>
+      </w:r>
+      <w:r>
+        <w:rPr>
+          <w:rFonts w:hint="eastAsia"/>
+        </w:rPr>
+        <w:t xml:space="preserve">周期的轴向纹波。点目标体模</w:t>
       </w:r>
       <w:r>
         <w:t xml:space="preserve"> P3 </w:t>
@@ -14628,7 +15387,16 @@
         <w:rPr>
           <w:rFonts w:hint="eastAsia"/>
         </w:rPr>
-        <w:t xml:space="preserve">点目标，在</w:t>
+        <w:t xml:space="preserve">的</w:t>
+      </w:r>
+      <w:r>
+        <w:t xml:space="preserve"> 6 </w:t>
+      </w:r>
+      <w:r>
+        <w:rPr>
+          <w:rFonts w:hint="eastAsia"/>
+        </w:rPr>
+        <w:t xml:space="preserve">个轴上散射子仍然保留作交叉验证：它在</w:t>
       </w:r>
       <w:r>
         <w:t xml:space="preserve"> 15/25/30/35/45/55 mm </w:t>
@@ -14637,34 +15405,25 @@
         <w:rPr>
           <w:rFonts w:hint="eastAsia"/>
         </w:rPr>
-        <w:t xml:space="preserve">处测</w:t>
-      </w:r>
-      <w:r>
-        <w:t xml:space="preserve"> −10 dB </w:t>
-      </w:r>
-      <w:r>
-        <w:rPr>
-          <w:rFonts w:hint="eastAsia"/>
-        </w:rPr>
-        <w:t xml:space="preserve">横向宽度，PW、C11、单焦点</w:t>
-      </w:r>
-      <w:r>
-        <w:t xml:space="preserve"> </w:t>
-      </w:r>
-      <w:r>
-        <w:rPr>
-          <w:rFonts w:hint="eastAsia"/>
-        </w:rPr>
-        <w:t xml:space="preserve">各一条曲线。−6</w:t>
-      </w:r>
-      <w:r>
-        <w:t xml:space="preserve"> dB </w:t>
-      </w:r>
-      <w:r>
-        <w:rPr>
-          <w:rFonts w:hint="eastAsia"/>
-        </w:rPr>
-        <w:t xml:space="preserve">轴向宽度只作</w:t>
+        <w:t xml:space="preserve">的读数（表</w:t>
+      </w:r>
+      <w:r>
+        <w:t xml:space="preserve"> </w:t>
+      </w:r>
+      <w:r>
+        <w:rPr>
+          <w:rFonts w:hint="eastAsia"/>
+        </w:rPr>
+        <w:t xml:space="preserve">T-B）与逐点实验逐一吻合。轴向同样取</w:t>
+      </w:r>
+      <w:r>
+        <w:t xml:space="preserve"> −6 </w:t>
+      </w:r>
+      <w:r>
+        <w:rPr>
+          <w:rFonts w:hint="eastAsia"/>
+        </w:rPr>
+        <w:t xml:space="preserve">dB，但只作</w:t>
       </w:r>
       <w:r>
         <w:t xml:space="preserve"> </w:t>
@@ -14804,10 +15563,53 @@
         <w:rPr>
           <w:rFonts w:hint="eastAsia"/>
         </w:rPr>
-        <w:t xml:space="preserve">曲线；以</w:t>
-      </w:r>
-      <w:r>
-        <w:t xml:space="preserve"> PW </w:t>
+        <w:t xml:space="preserve">曲线；报</w:t>
+      </w:r>
+      <w:r>
+        <w:rPr>
+          <w:rFonts w:hint="eastAsia"/>
+          <w:b/>
+          <w:bCs/>
+        </w:rPr>
+        <w:t xml:space="preserve">绝对</w:t>
+      </w:r>
+      <w:r>
+        <w:t xml:space="preserve"> </w:t>
+      </w:r>
+      <w:r>
+        <w:rPr>
+          <w:rFonts w:hint="eastAsia"/>
+        </w:rPr>
+        <w:t xml:space="preserve">dB，刻度由</w:t>
+      </w:r>
+      <w:r>
+        <w:t xml:space="preserve"> </w:t>
+      </w:r>
+      <m:oMath>
+        <m:sSub>
+          <m:e>
+            <m:r>
+              <m:t>σ</m:t>
+            </m:r>
+          </m:e>
+          <m:sub>
+            <m:r>
+              <m:t>e</m:t>
+            </m:r>
+          </m:sub>
+        </m:sSub>
+      </m:oMath>
+      <w:r>
+        <w:t xml:space="preserve"> </w:t>
+      </w:r>
+      <w:r>
+        <w:rPr>
+          <w:rFonts w:hint="eastAsia"/>
+        </w:rPr>
+        <w:t xml:space="preserve">标定（PW</w:t>
+      </w:r>
+      <w:r>
+        <w:t xml:space="preserve"> </w:t>
       </w:r>
       <w:r>
         <w:rPr>
@@ -14822,16 +15624,25 @@
         <w:rPr>
           <w:rFonts w:hint="eastAsia"/>
         </w:rPr>
-        <w:t xml:space="preserve">处为</w:t>
-      </w:r>
-      <w:r>
-        <w:t xml:space="preserve"> 0 dB </w:t>
-      </w:r>
-      <w:r>
-        <w:rPr>
-          <w:rFonts w:hint="eastAsia"/>
-        </w:rPr>
-        <w:t xml:space="preserve">参考。</w:t>
+        <w:t xml:space="preserve">处</w:t>
+      </w:r>
+      <w:r>
+        <w:t xml:space="preserve"> 20 </w:t>
+      </w:r>
+      <w:r>
+        <w:rPr>
+          <w:rFonts w:hint="eastAsia"/>
+        </w:rPr>
+        <w:t xml:space="preserve">dB，见报告</w:t>
+      </w:r>
+      <w:r>
+        <w:t xml:space="preserve"> </w:t>
+      </w:r>
+      <w:r>
+        <w:rPr>
+          <w:rFonts w:hint="eastAsia"/>
+        </w:rPr>
+        <w:t xml:space="preserve">5.7）。</w:t>
       </w:r>
     </w:p>
     <w:p>
@@ -19240,7 +20051,7 @@
               <w:t xml:space="preserve">点目标横向包络的</w:t>
             </w:r>
             <w:r>
-              <w:t xml:space="preserve"> −10 dB </w:t>
+              <w:t xml:space="preserve"> −6 dB </w:t>
             </w:r>
             <w:r>
               <w:rPr>
@@ -20063,57 +20874,130 @@
               <w:pStyle w:val="Compact"/>
             </w:pPr>
             <w:r>
-              <w:rPr>
-                <w:rFonts w:hint="eastAsia"/>
-              </w:rPr>
-              <w:t xml:space="preserve">相对</w:t>
-            </w:r>
-            <w:r>
-              <w:t xml:space="preserve"> SNR</w:t>
-            </w:r>
-          </w:p>
-        </w:tc>
-        <w:tc>
-          <w:tcPr/>
-          <w:p>
-            <w:pPr>
-              <w:pStyle w:val="Compact"/>
-            </w:pPr>
-            <w:r>
-              <w:rPr>
-                <w:rFonts w:hint="eastAsia"/>
-              </w:rPr>
-              <w:t xml:space="preserve">各方法</w:t>
-            </w:r>
-            <w:r>
-              <w:t xml:space="preserve"> SNR </w:t>
-            </w:r>
-            <w:r>
-              <w:rPr>
-                <w:rFonts w:hint="eastAsia"/>
-              </w:rPr>
-              <w:t xml:space="preserve">减去</w:t>
-            </w:r>
-            <w:r>
-              <w:t xml:space="preserve"> PW </w:t>
-            </w:r>
-            <w:r>
-              <w:rPr>
-                <w:rFonts w:hint="eastAsia"/>
-              </w:rPr>
-              <w:t xml:space="preserve">在</w:t>
-            </w:r>
-            <w:r>
-              <w:t xml:space="preserve"> 30 mm </w:t>
-            </w:r>
-            <w:r>
-              <w:rPr>
-                <w:rFonts w:hint="eastAsia"/>
-              </w:rPr>
-              <w:t xml:space="preserve">的</w:t>
-            </w:r>
-            <w:r>
-              <w:t xml:space="preserve"> SNR</w:t>
+              <w:t xml:space="preserve">SNR</w:t>
+            </w:r>
+          </w:p>
+        </w:tc>
+        <w:tc>
+          <w:tcPr/>
+          <w:p>
+            <w:pPr>
+              <w:pStyle w:val="Compact"/>
+            </w:pPr>
+            <m:oMath>
+              <m:r>
+                <m:t>10</m:t>
+              </m:r>
+              <m:sSub>
+                <m:e>
+                  <m:r>
+                    <m:rPr>
+                      <m:sty m:val="p"/>
+                    </m:rPr>
+                    <m:t>log</m:t>
+                  </m:r>
+                </m:e>
+                <m:sub>
+                  <m:r>
+                    <m:t>10</m:t>
+                  </m:r>
+                </m:sub>
+              </m:sSub>
+              <m:r>
+                <m:rPr>
+                  <m:sty m:val="p"/>
+                </m:rPr>
+                <m:t>(</m:t>
+              </m:r>
+              <m:bar>
+                <m:barPr>
+                  <m:pos m:val="top"/>
+                </m:barPr>
+                <m:e>
+                  <m:sSup>
+                    <m:e>
+                      <m:r>
+                        <m:t>s</m:t>
+                      </m:r>
+                    </m:e>
+                    <m:sup>
+                      <m:r>
+                        <m:t>2</m:t>
+                      </m:r>
+                    </m:sup>
+                  </m:sSup>
+                </m:e>
+              </m:bar>
+              <m:r>
+                <m:rPr>
+                  <m:sty m:val="p"/>
+                </m:rPr>
+                <m:t>/</m:t>
+              </m:r>
+              <m:sSubSup>
+                <m:e>
+                  <m:r>
+                    <m:t>σ</m:t>
+                  </m:r>
+                </m:e>
+                <m:sub>
+                  <m:r>
+                    <m:t>N</m:t>
+                  </m:r>
+                </m:sub>
+                <m:sup>
+                  <m:r>
+                    <m:t>2</m:t>
+                  </m:r>
+                </m:sup>
+              </m:sSubSup>
+              <m:r>
+                <m:rPr>
+                  <m:sty m:val="p"/>
+                </m:rPr>
+                <m:t>)</m:t>
+              </m:r>
+            </m:oMath>
+            <w:r>
+              <w:rPr>
+                <w:rFonts w:hint="eastAsia"/>
+              </w:rPr>
+              <w:t xml:space="preserve">，5×5</w:t>
+            </w:r>
+            <w:r>
+              <w:t xml:space="preserve"> mm </w:t>
+            </w:r>
+            <w:r>
+              <w:rPr>
+                <w:rFonts w:hint="eastAsia"/>
+              </w:rPr>
+              <w:t xml:space="preserve">滑窗；绝对值，刻度由</w:t>
+            </w:r>
+            <w:r>
+              <w:t xml:space="preserve"> </w:t>
+            </w:r>
+            <m:oMath>
+              <m:sSub>
+                <m:e>
+                  <m:r>
+                    <m:t>σ</m:t>
+                  </m:r>
+                </m:e>
+                <m:sub>
+                  <m:r>
+                    <m:t>e</m:t>
+                  </m:r>
+                </m:sub>
+              </m:sSub>
+            </m:oMath>
+            <w:r>
+              <w:t xml:space="preserve"> </w:t>
+            </w:r>
+            <w:r>
+              <w:rPr>
+                <w:rFonts w:hint="eastAsia"/>
+              </w:rPr>
+              <w:t xml:space="preserve">标定</w:t>
             </w:r>
           </w:p>
         </w:tc>
@@ -21769,8 +22653,31 @@
               <w:rPr>
                 <w:rFonts w:hint="eastAsia"/>
               </w:rPr>
-              <w:t xml:space="preserve">合成声场（11</w:t>
-            </w:r>
+              <w:t xml:space="preserve">成像区域均匀性：峰值幅度、幅度残差、−6</w:t>
+            </w:r>
+            <w:r>
+              <w:t xml:space="preserve"> dB </w:t>
+            </w:r>
+            <w:r>
+              <w:rPr>
+                <w:rFonts w:hint="eastAsia"/>
+              </w:rPr>
+              <w:t xml:space="preserve">横向宽度、宽度残差（</w:t>
+            </w:r>
+            <m:oMath>
+              <m:r>
+                <m:t>11</m:t>
+              </m:r>
+              <m:r>
+                <m:rPr>
+                  <m:sty m:val="p"/>
+                </m:rPr>
+                <m:t>×</m:t>
+              </m:r>
+              <m:r>
+                <m:t>15</m:t>
+              </m:r>
+            </m:oMath>
             <w:r>
               <w:t xml:space="preserve"> </w:t>
             </w:r>
@@ -21778,16 +22685,7 @@
               <w:rPr>
                 <w:rFonts w:hint="eastAsia"/>
               </w:rPr>
-              <w:t xml:space="preserve">角度，焦点</w:t>
-            </w:r>
-            <w:r>
-              <w:t xml:space="preserve"> 30 </w:t>
-            </w:r>
-            <w:r>
-              <w:rPr>
-                <w:rFonts w:hint="eastAsia"/>
-              </w:rPr>
-              <w:t xml:space="preserve">mm）+</w:t>
+              <w:t xml:space="preserve">个逐点</w:t>
             </w:r>
             <w:r>
               <w:t xml:space="preserve"> </w:t>
@@ -21796,16 +22694,30 @@
               <w:rPr>
                 <w:rFonts w:hint="eastAsia"/>
               </w:rPr>
-              <w:t xml:space="preserve">焦点附近剖面</w:t>
-            </w:r>
-            <w:r>
-              <w:t xml:space="preserve"> + </w:t>
-            </w:r>
-            <w:r>
-              <w:rPr>
-                <w:rFonts w:hint="eastAsia"/>
-              </w:rPr>
-              <w:t xml:space="preserve">与聚焦发射对比</w:t>
+              <w:t xml:space="preserve">PSF，</w:t>
+            </w:r>
+            <m:oMath>
+              <m:r>
+                <m:t>2</m:t>
+              </m:r>
+              <m:r>
+                <m:rPr>
+                  <m:sty m:val="p"/>
+                </m:rPr>
+                <m:t>×</m:t>
+              </m:r>
+              <m:r>
+                <m:t>2</m:t>
+              </m:r>
+            </m:oMath>
+            <w:r>
+              <w:t xml:space="preserve"> </w:t>
+            </w:r>
+            <w:r>
+              <w:rPr>
+                <w:rFonts w:hint="eastAsia"/>
+              </w:rPr>
+              <w:t xml:space="preserve">排布）</w:t>
             </w:r>
           </w:p>
         </w:tc>
@@ -21843,34 +22755,34 @@
               <w:rPr>
                 <w:rFonts w:hint="eastAsia"/>
               </w:rPr>
-              <w:t xml:space="preserve">单平面波</w:t>
-            </w:r>
-            <w:r>
-              <w:t xml:space="preserve"> 128 </w:t>
-            </w:r>
-            <w:r>
-              <w:rPr>
-                <w:rFonts w:hint="eastAsia"/>
-              </w:rPr>
-              <w:t xml:space="preserve">通道</w:t>
-            </w:r>
-            <w:r>
-              <w:t xml:space="preserve"> RF </w:t>
-            </w:r>
-            <w:r>
-              <w:rPr>
-                <w:rFonts w:hint="eastAsia"/>
-              </w:rPr>
-              <w:t xml:space="preserve">图（含</w:t>
-            </w:r>
-            <w:r>
-              <w:t xml:space="preserve"> 3 </w:t>
-            </w:r>
-            <w:r>
-              <w:rPr>
-                <w:rFonts w:hint="eastAsia"/>
-              </w:rPr>
-              <w:t xml:space="preserve">条波形、点目标双曲线放大）</w:t>
+              <w:t xml:space="preserve">单平面波：128</w:t>
+            </w:r>
+            <w:r>
+              <w:t xml:space="preserve"> </w:t>
+            </w:r>
+            <w:r>
+              <w:rPr>
+                <w:rFonts w:hint="eastAsia"/>
+              </w:rPr>
+              <w:t xml:space="preserve">通道射频幅度（横轴阵元、纵轴往返深度）→</w:t>
+            </w:r>
+            <w:r>
+              <w:t xml:space="preserve"> </w:t>
+            </w:r>
+            <w:r>
+              <w:rPr>
+                <w:rFonts w:hint="eastAsia"/>
+              </w:rPr>
+              <w:t xml:space="preserve">单角度</w:t>
+            </w:r>
+            <w:r>
+              <w:t xml:space="preserve"> DAS → 11 </w:t>
+            </w:r>
+            <w:r>
+              <w:rPr>
+                <w:rFonts w:hint="eastAsia"/>
+              </w:rPr>
+              <w:t xml:space="preserve">角度复合，三幅并排</w:t>
             </w:r>
           </w:p>
         </w:tc>
@@ -22067,16 +22979,57 @@
               <w:rPr>
                 <w:rFonts w:hint="eastAsia"/>
               </w:rPr>
-              <w:t xml:space="preserve">深度（PW</w:t>
-            </w:r>
-            <w:r>
-              <w:t xml:space="preserve"> / C11 / </w:t>
-            </w:r>
-            <w:r>
-              <w:rPr>
-                <w:rFonts w:hint="eastAsia"/>
-              </w:rPr>
-              <w:t xml:space="preserve">单焦点）</w:t>
+              <w:t xml:space="preserve">深度（</w:t>
+            </w:r>
+            <m:oMath>
+              <m:r>
+                <m:t>x</m:t>
+              </m:r>
+              <m:r>
+                <m:rPr>
+                  <m:sty m:val="p"/>
+                </m:rPr>
+                <m:t>=</m:t>
+              </m:r>
+              <m:r>
+                <m:t>0</m:t>
+              </m:r>
+            </m:oMath>
+            <w:r>
+              <w:t xml:space="preserve"> </w:t>
+            </w:r>
+            <w:r>
+              <w:rPr>
+                <w:rFonts w:hint="eastAsia"/>
+              </w:rPr>
+              <w:t xml:space="preserve">轴上逐点单散射子，26</w:t>
+            </w:r>
+            <w:r>
+              <w:t xml:space="preserve"> </w:t>
+            </w:r>
+            <w:r>
+              <w:rPr>
+                <w:rFonts w:hint="eastAsia"/>
+              </w:rPr>
+              <w:t xml:space="preserve">个深度、2</w:t>
+            </w:r>
+            <w:r>
+              <w:t xml:space="preserve"> mm </w:t>
+            </w:r>
+            <w:r>
+              <w:rPr>
+                <w:rFonts w:hint="eastAsia"/>
+              </w:rPr>
+              <w:t xml:space="preserve">间隔；聚焦另附</w:t>
+            </w:r>
+            <w:r>
+              <w:t xml:space="preserve"> 0.5 mm </w:t>
+            </w:r>
+            <w:r>
+              <w:rPr>
+                <w:rFonts w:hint="eastAsia"/>
+              </w:rPr>
+              <w:t xml:space="preserve">细扫）</w:t>
             </w:r>
           </w:p>
         </w:tc>
@@ -22114,16 +23067,7 @@
               <w:rPr>
                 <w:rFonts w:hint="eastAsia"/>
               </w:rPr>
-              <w:t xml:space="preserve">对比度与</w:t>
-            </w:r>
-            <w:r>
-              <w:t xml:space="preserve"> CNR </w:t>
-            </w:r>
-            <w:r>
-              <w:rPr>
-                <w:rFonts w:hint="eastAsia"/>
-              </w:rPr>
-              <w:t xml:space="preserve">的柱状图（PW</w:t>
+              <w:t xml:space="preserve">囊肿对比度的柱状图（PW</w:t>
             </w:r>
             <w:r>
               <w:t xml:space="preserve"> / C11 / </w:t>
@@ -23823,6 +24767,80 @@
         </w:tc>
       </w:tr>
     </w:tbl>
+    <w:p>
+      <w:pPr>
+        <w:pStyle w:val="BodyText"/>
+      </w:pPr>
+      <w:r>
+        <w:rPr>
+          <w:rFonts w:hint="eastAsia"/>
+        </w:rPr>
+        <w:t xml:space="preserve">表外还有一项由</w:t>
+      </w:r>
+      <w:r>
+        <w:t xml:space="preserve"> refresh </w:t>
+      </w:r>
+      <w:r>
+        <w:rPr>
+          <w:rFonts w:hint="eastAsia"/>
+        </w:rPr>
+        <w:t xml:space="preserve">阶段完成的逐点实验（v2.8，图</w:t>
+      </w:r>
+      <w:r>
+        <w:t xml:space="preserve"> F10 </w:t>
+      </w:r>
+      <w:r>
+        <w:rPr>
+          <w:rFonts w:hint="eastAsia"/>
+        </w:rPr>
+        <w:t xml:space="preserve">的数据）：26</w:t>
+      </w:r>
+      <w:r>
+        <w:t xml:space="preserve"> </w:t>
+      </w:r>
+      <w:r>
+        <w:rPr>
+          <w:rFonts w:hint="eastAsia"/>
+        </w:rPr>
+        <w:t xml:space="preserve">个深度</w:t>
+      </w:r>
+      <w:r>
+        <w:t xml:space="preserve"> × 12 </w:t>
+      </w:r>
+      <w:r>
+        <w:rPr>
+          <w:rFonts w:hint="eastAsia"/>
+        </w:rPr>
+        <w:t xml:space="preserve">次发射，另加聚焦的</w:t>
+      </w:r>
+      <w:r>
+        <w:t xml:space="preserve"> 0.5 mm </w:t>
+      </w:r>
+      <w:r>
+        <w:rPr>
+          <w:rFonts w:hint="eastAsia"/>
+        </w:rPr>
+        <w:t xml:space="preserve">细扫</w:t>
+      </w:r>
+      <w:r>
+        <w:t xml:space="preserve"> 101 × 58 </w:t>
+      </w:r>
+      <w:r>
+        <w:rPr>
+          <w:rFonts w:hint="eastAsia"/>
+        </w:rPr>
+        <w:t xml:space="preserve">次发射，首次约</w:t>
+      </w:r>
+      <w:r>
+        <w:t xml:space="preserve"> 3.5 </w:t>
+      </w:r>
+      <w:r>
+        <w:rPr>
+          <w:rFonts w:hint="eastAsia"/>
+        </w:rPr>
+        <w:t xml:space="preserve">min；结果落盘后由输入指纹命中跳过，不再重算。</w:t>
+      </w:r>
+    </w:p>
     <w:bookmarkEnd w:id="48"/>
     <w:bookmarkStart w:id="49" w:name="执行顺序与检查点"/>
     <w:p>
@@ -25521,16 +26539,16 @@
               <w:rPr>
                 <w:rFonts w:hint="eastAsia"/>
               </w:rPr>
-              <w:t xml:space="preserve">只比较相对</w:t>
-            </w:r>
-            <w:r>
-              <w:t xml:space="preserve"> </w:t>
-            </w:r>
-            <w:r>
-              <w:rPr>
-                <w:rFonts w:hint="eastAsia"/>
-              </w:rPr>
-              <w:t xml:space="preserve">SNR；可选中心频率近似衰减</w:t>
+              <w:t xml:space="preserve">只比较方法间的</w:t>
+            </w:r>
+            <w:r>
+              <w:t xml:space="preserve"> SNR </w:t>
+            </w:r>
+            <w:r>
+              <w:rPr>
+                <w:rFonts w:hint="eastAsia"/>
+              </w:rPr>
+              <w:t xml:space="preserve">差值；可选中心频率近似衰减</w:t>
             </w:r>
           </w:p>
         </w:tc>
@@ -26275,13 +27293,13 @@
               <w:pStyle w:val="Compact"/>
             </w:pPr>
             <w:r>
-              <w:rPr>
-                <w:rFonts w:hint="eastAsia"/>
-              </w:rPr>
-              <w:t xml:space="preserve">相对</w:t>
-            </w:r>
-            <w:r>
-              <w:t xml:space="preserve"> SNR / dB</w:t>
+              <w:t xml:space="preserve">SNR / </w:t>
+            </w:r>
+            <w:r>
+              <w:rPr>
+                <w:rFonts w:hint="eastAsia"/>
+              </w:rPr>
+              <w:t xml:space="preserve">dB（绝对刻度）</w:t>
             </w:r>
           </w:p>
         </w:tc>
@@ -26589,14 +27607,14 @@
           <w:b/>
           <w:bCs/>
         </w:rPr>
-        <w:t xml:space="preserve">实测对照（修正接收孔径之后，见报告</w:t>
+        <w:t xml:space="preserve">实测对照（修正接收孔径</w:t>
       </w:r>
       <w:r>
         <w:rPr>
           <w:b/>
           <w:bCs/>
         </w:rPr>
-        <w:t xml:space="preserve"> 5.5–5.7 </w:t>
+        <w:t xml:space="preserve"> B12 </w:t>
       </w:r>
       <w:r>
         <w:rPr>
@@ -26604,14 +27622,14 @@
           <w:b/>
           <w:bCs/>
         </w:rPr>
-        <w:t xml:space="preserve">与归档</w:t>
+        <w:t xml:space="preserve">与发射项</w:t>
       </w:r>
       <w:r>
         <w:rPr>
           <w:b/>
           <w:bCs/>
         </w:rPr>
-        <w:t xml:space="preserve"> </w:t>
+        <w:t xml:space="preserve"> B20 </w:t>
       </w:r>
       <w:r>
         <w:rPr>
@@ -26619,7 +27637,22 @@
           <w:b/>
           <w:bCs/>
         </w:rPr>
-        <w:t xml:space="preserve">B12）</w:t>
+        <w:t xml:space="preserve">之后，见报告</w:t>
+      </w:r>
+      <w:r>
+        <w:rPr>
+          <w:b/>
+          <w:bCs/>
+        </w:rPr>
+        <w:t xml:space="preserve"> </w:t>
+      </w:r>
+      <w:r>
+        <w:rPr>
+          <w:rFonts w:hint="eastAsia"/>
+          <w:b/>
+          <w:bCs/>
+        </w:rPr>
+        <w:t xml:space="preserve">5.5–5.7）</w:t>
       </w:r>
       <w:r>
         <w:rPr>
@@ -26628,7 +27661,7 @@
         <w:t xml:space="preserve">：单平面波</w:t>
       </w:r>
       <w:r>
-        <w:t xml:space="preserve"> 1.00 mm / 12.6 dB / 0 </w:t>
+        <w:t xml:space="preserve"> 0.83–0.86 mm / 12.8 dB / 0 </w:t>
       </w:r>
       <w:r>
         <w:rPr>
@@ -26637,7 +27670,7 @@
         <w:t xml:space="preserve">dB；C11</w:t>
       </w:r>
       <w:r>
-        <w:t xml:space="preserve"> 0.91–0.93 mm / 22.6 dB / +8.7 </w:t>
+        <w:t xml:space="preserve"> 0.74–0.75 mm / 23.3 dB / +8.8 </w:t>
       </w:r>
       <w:r>
         <w:rPr>
@@ -26646,7 +27679,25 @@
         <w:t xml:space="preserve">dB；单焦点在焦点处</w:t>
       </w:r>
       <w:r>
-        <w:t xml:space="preserve"> 0.77 mm / 16.0 dB / +11.3 </w:t>
+        <w:t xml:space="preserve"> 0.65 mm / 22.2 </w:t>
+      </w:r>
+      <w:r>
+        <w:rPr>
+          <w:rFonts w:hint="eastAsia"/>
+        </w:rPr>
+        <w:t xml:space="preserve">dB（按深度</w:t>
+      </w:r>
+      <w:r>
+        <w:t xml:space="preserve"> 21.2/29.0/16.3 </w:t>
+      </w:r>
+      <w:r>
+        <w:rPr>
+          <w:rFonts w:hint="eastAsia"/>
+        </w:rPr>
+        <w:t xml:space="preserve">dB）/</w:t>
+      </w:r>
+      <w:r>
+        <w:t xml:space="preserve"> +10.9 </w:t>
       </w:r>
       <w:r>
         <w:rPr>
@@ -26655,22 +27706,49 @@
         <w:t xml:space="preserve">dB，焦外</w:t>
       </w:r>
       <w:r>
-        <w:t xml:space="preserve"> 0.95–1.04 mm / </w:t>
-      </w:r>
-      <w:r>
-        <w:rPr>
-          <w:rFonts w:hint="eastAsia"/>
-        </w:rPr>
-        <w:t xml:space="preserve">按深度平均</w:t>
-      </w:r>
-      <w:r>
-        <w:t xml:space="preserve"> 13.7 dB / −0.4…−4.2 </w:t>
-      </w:r>
-      <w:r>
-        <w:rPr>
-          <w:rFonts w:hint="eastAsia"/>
-        </w:rPr>
-        <w:t xml:space="preserve">dB。与上表相比有两处偏差：分辨率整体好于预期（二维体模、无衰减，见归档</w:t>
+        <w:t xml:space="preserve"> 0.80–0.90 </w:t>
+      </w:r>
+      <w:r>
+        <w:rPr>
+          <w:rFonts w:hint="eastAsia"/>
+        </w:rPr>
+        <w:t xml:space="preserve">mm（宽度均为</w:t>
+      </w:r>
+      <w:r>
+        <w:t xml:space="preserve"> −6 dB </w:t>
+      </w:r>
+      <w:r>
+        <w:rPr>
+          <w:rFonts w:hint="eastAsia"/>
+        </w:rPr>
+        <w:t xml:space="preserve">全宽；SNR</w:t>
+      </w:r>
+      <w:r>
+        <w:t xml:space="preserve"> </w:t>
+      </w:r>
+      <w:r>
+        <w:rPr>
+          <w:rFonts w:hint="eastAsia"/>
+        </w:rPr>
+        <w:t xml:space="preserve">一列是绝对</w:t>
+      </w:r>
+      <w:r>
+        <w:t xml:space="preserve"> SNR </w:t>
+      </w:r>
+      <w:r>
+        <w:rPr>
+          <w:rFonts w:hint="eastAsia"/>
+        </w:rPr>
+        <w:t xml:space="preserve">之差，绝对刻度见报告</w:t>
+      </w:r>
+      <w:r>
+        <w:t xml:space="preserve"> </w:t>
+      </w:r>
+      <w:r>
+        <w:rPr>
+          <w:rFonts w:hint="eastAsia"/>
+        </w:rPr>
+        <w:t xml:space="preserve">5.7）。与上表相比有两处偏差：分辨率整体好于预期（二维体模、无衰减，见归档</w:t>
       </w:r>
       <w:r>
         <w:t xml:space="preserve"> </w:t>
@@ -26957,7 +28035,7 @@
         <w:rPr>
           <w:rFonts w:hint="eastAsia"/>
         </w:rPr>
-        <w:t xml:space="preserve">的理论极限，−10</w:t>
+        <w:t xml:space="preserve">的理论极限，−6</w:t>
       </w:r>
       <w:r>
         <w:t xml:space="preserve"> dB </w:t>
@@ -26969,7 +28047,7 @@
         <w:t xml:space="preserve">宽度约</w:t>
       </w:r>
       <w:r>
-        <w:t xml:space="preserve"> 1.0–1.2 </w:t>
+        <w:t xml:space="preserve"> 0.8–0.9 </w:t>
       </w:r>
       <w:r>
         <w:rPr>
@@ -27325,16 +28403,16 @@
         <w:rPr>
           <w:rFonts w:hint="eastAsia"/>
         </w:rPr>
-        <w:t xml:space="preserve">：基线不开启，只比较相对</w:t>
-      </w:r>
-      <w:r>
-        <w:t xml:space="preserve"> </w:t>
-      </w:r>
-      <w:r>
-        <w:rPr>
-          <w:rFonts w:hint="eastAsia"/>
-        </w:rPr>
-        <w:t xml:space="preserve">SNR；是否需要加中心频率近似衰减？</w:t>
+        <w:t xml:space="preserve">：基线不开启，只比较方法间的</w:t>
+      </w:r>
+      <w:r>
+        <w:t xml:space="preserve"> SNR </w:t>
+      </w:r>
+      <w:r>
+        <w:rPr>
+          <w:rFonts w:hint="eastAsia"/>
+        </w:rPr>
+        <w:t xml:space="preserve">差值；是否需要加中心频率近似衰减？</w:t>
       </w:r>
     </w:p>
     <w:p>
@@ -27357,25 +28435,82 @@
         <w:rPr>
           <w:rFonts w:hint="eastAsia"/>
         </w:rPr>
-        <w:t xml:space="preserve">：本设计稿为</w:t>
-      </w:r>
-      <w:r>
-        <w:t xml:space="preserve"> </w:t>
-      </w:r>
-      <w:r>
-        <w:rPr>
-          <w:rFonts w:hint="eastAsia"/>
-        </w:rPr>
-        <w:t xml:space="preserve">Markdown；正式报告是否需要</w:t>
-      </w:r>
-      <w:r>
-        <w:t xml:space="preserve"> </w:t>
-      </w:r>
-      <w:r>
-        <w:rPr>
-          <w:rFonts w:hint="eastAsia"/>
-        </w:rPr>
-        <w:t xml:space="preserve">Word/PDF？图表是否需要中文标注？</w:t>
+        <w:t xml:space="preserve">：设计稿为</w:t>
+      </w:r>
+      <w:r>
+        <w:t xml:space="preserve"> </w:t>
+      </w:r>
+      <w:r>
+        <w:rPr>
+          <w:rFonts w:hint="eastAsia"/>
+        </w:rPr>
+        <w:t xml:space="preserve">Markdown；正式报告另出</w:t>
+      </w:r>
+      <w:r>
+        <w:t xml:space="preserve"> </w:t>
+      </w:r>
+      <w:r>
+        <w:rPr>
+          <w:rFonts w:hint="eastAsia"/>
+        </w:rPr>
+        <w:t xml:space="preserve">Word（</w:t>
+      </w:r>
+      <w:r>
+        <w:rPr>
+          <w:rStyle w:val="VerbatimChar"/>
+        </w:rPr>
+        <w:t xml:space="preserve">docs/*.docx</w:t>
+      </w:r>
+      <w:r>
+        <w:rPr>
+          <w:rFonts w:hint="eastAsia"/>
+        </w:rPr>
+        <w:t xml:space="preserve">，由</w:t>
+      </w:r>
+      <w:r>
+        <w:t xml:space="preserve"> pandoc </w:t>
+      </w:r>
+      <w:r>
+        <w:rPr>
+          <w:rFonts w:hint="eastAsia"/>
+        </w:rPr>
+        <w:t xml:space="preserve">生成）。图表标注已按您的要求统一改为中文（图</w:t>
+      </w:r>
+      <w:r>
+        <w:t xml:space="preserve"> F1–F14 </w:t>
+      </w:r>
+      <w:r>
+        <w:rPr>
+          <w:rFonts w:hint="eastAsia"/>
+        </w:rPr>
+        <w:t xml:space="preserve">的标题、坐标轴、图例、色标全部中文，字体用系统的微软雅黑，代码里由</w:t>
+      </w:r>
+      <w:r>
+        <w:t xml:space="preserve"> </w:t>
+      </w:r>
+      <w:r>
+        <w:rPr>
+          <w:rStyle w:val="VerbatimChar"/>
+        </w:rPr>
+        <w:t xml:space="preserve">src/save_fig.m</w:t>
+      </w:r>
+      <w:r>
+        <w:t xml:space="preserve"> </w:t>
+      </w:r>
+      <w:r>
+        <w:rPr>
+          <w:rFonts w:hint="eastAsia"/>
+        </w:rPr>
+        <w:t xml:space="preserve">统一设定）。是否还需要</w:t>
+      </w:r>
+      <w:r>
+        <w:t xml:space="preserve"> </w:t>
+      </w:r>
+      <w:r>
+        <w:rPr>
+          <w:rFonts w:hint="eastAsia"/>
+        </w:rPr>
+        <w:t xml:space="preserve">PDF？</w:t>
       </w:r>
     </w:p>
     <w:p>
@@ -30868,6 +32003,1134 @@
                 <w:rFonts w:hint="eastAsia"/>
               </w:rPr>
               <w:t xml:space="preserve">同步为此版字段名</w:t>
+            </w:r>
+          </w:p>
+        </w:tc>
+      </w:tr>
+      <w:tr>
+        <w:tc>
+          <w:tcPr/>
+          <w:p>
+            <w:pPr>
+              <w:pStyle w:val="Compact"/>
+            </w:pPr>
+            <w:r>
+              <w:t xml:space="preserve">v2.3</w:t>
+            </w:r>
+          </w:p>
+        </w:tc>
+        <w:tc>
+          <w:tcPr/>
+          <w:p>
+            <w:pPr>
+              <w:pStyle w:val="Compact"/>
+            </w:pPr>
+            <w:r>
+              <w:t xml:space="preserve">2026-10-28</w:t>
+            </w:r>
+          </w:p>
+        </w:tc>
+        <w:tc>
+          <w:tcPr/>
+          <w:p>
+            <w:pPr>
+              <w:pStyle w:val="Compact"/>
+            </w:pPr>
+            <w:r>
+              <w:rPr>
+                <w:rFonts w:hint="eastAsia"/>
+              </w:rPr>
+              <w:t xml:space="preserve">声场图网格</w:t>
+            </w:r>
+            <w:r>
+              <w:t xml:space="preserve"> 1 mm → 0.5 mm </w:t>
+            </w:r>
+            <w:r>
+              <w:rPr>
+                <w:rFonts w:hint="eastAsia"/>
+              </w:rPr>
+              <w:t xml:space="preserve">且每点取</w:t>
+            </w:r>
+            <w:r>
+              <w:t xml:space="preserve"> 5 </w:t>
+            </w:r>
+            <w:r>
+              <w:rPr>
+                <w:rFonts w:hint="eastAsia"/>
+              </w:rPr>
+              <w:t xml:space="preserve">个亚样本平均（消除</w:t>
+            </w:r>
+            <w:r>
+              <w:t xml:space="preserve"> </w:t>
+            </w:r>
+            <m:oMath>
+              <m:r>
+                <m:t>c</m:t>
+              </m:r>
+              <m:r>
+                <m:rPr>
+                  <m:sty m:val="p"/>
+                </m:rPr>
+                <m:t>/</m:t>
+              </m:r>
+              <m:sSub>
+                <m:e>
+                  <m:r>
+                    <m:t>f</m:t>
+                  </m:r>
+                </m:e>
+                <m:sub>
+                  <m:r>
+                    <m:t>s</m:t>
+                  </m:r>
+                </m:sub>
+              </m:sSub>
+            </m:oMath>
+            <w:r>
+              <w:t xml:space="preserve"> </w:t>
+            </w:r>
+            <w:r>
+              <w:rPr>
+                <w:rFonts w:hint="eastAsia"/>
+              </w:rPr>
+              <w:t xml:space="preserve">周期的采样伪迹，图</w:t>
+            </w:r>
+            <w:r>
+              <w:t xml:space="preserve"> F3/F4/F14 </w:t>
+            </w:r>
+            <w:r>
+              <w:rPr>
+                <w:rFonts w:hint="eastAsia"/>
+              </w:rPr>
+              <w:t xml:space="preserve">重出，附录</w:t>
+            </w:r>
+            <w:r>
+              <w:t xml:space="preserve"> </w:t>
+            </w:r>
+            <w:r>
+              <w:rPr>
+                <w:rFonts w:hint="eastAsia"/>
+              </w:rPr>
+              <w:t xml:space="preserve">B22）；</w:t>
+            </w:r>
+            <w:r>
+              <w:rPr>
+                <w:rStyle w:val="VerbatimChar"/>
+              </w:rPr>
+              <w:t xml:space="preserve">params.m</w:t>
+            </w:r>
+            <w:r>
+              <w:t xml:space="preserve"> </w:t>
+            </w:r>
+            <w:r>
+              <w:rPr>
+                <w:rFonts w:hint="eastAsia"/>
+              </w:rPr>
+              <w:t xml:space="preserve">新增</w:t>
+            </w:r>
+            <w:r>
+              <w:t xml:space="preserve"> </w:t>
+            </w:r>
+            <w:r>
+              <w:rPr>
+                <w:rStyle w:val="VerbatimChar"/>
+              </w:rPr>
+              <w:t xml:space="preserve">fieldMapSubSamples</w:t>
+            </w:r>
+            <w:r>
+              <w:rPr>
+                <w:rFonts w:hint="eastAsia"/>
+              </w:rPr>
+              <w:t xml:space="preserve">；图</w:t>
+            </w:r>
+            <w:r>
+              <w:t xml:space="preserve"> F14 </w:t>
+            </w:r>
+            <w:r>
+              <w:rPr>
+                <w:rFonts w:hint="eastAsia"/>
+              </w:rPr>
+              <w:t xml:space="preserve">顶部加换能器示意图、成像区域框改暗红实线；图</w:t>
+            </w:r>
+            <w:r>
+              <w:t xml:space="preserve"> F6 </w:t>
+            </w:r>
+            <w:r>
+              <w:rPr>
+                <w:rFonts w:hint="eastAsia"/>
+              </w:rPr>
+              <w:t xml:space="preserve">改为三幅对照：128</w:t>
+            </w:r>
+            <w:r>
+              <w:t xml:space="preserve"> </w:t>
+            </w:r>
+            <w:r>
+              <w:rPr>
+                <w:rFonts w:hint="eastAsia"/>
+              </w:rPr>
+              <w:t xml:space="preserve">通道射频幅度</w:t>
+            </w:r>
+            <w:r>
+              <w:t xml:space="preserve"> → </w:t>
+            </w:r>
+            <w:r>
+              <w:rPr>
+                <w:rFonts w:hint="eastAsia"/>
+              </w:rPr>
+              <w:t xml:space="preserve">单角度</w:t>
+            </w:r>
+            <w:r>
+              <w:t xml:space="preserve"> DAS </w:t>
+            </w:r>
+            <w:r>
+              <w:rPr>
+                <w:rFonts w:hint="eastAsia"/>
+              </w:rPr>
+              <w:t xml:space="preserve">成像</w:t>
+            </w:r>
+            <w:r>
+              <w:t xml:space="preserve"> → 11 </w:t>
+            </w:r>
+            <w:r>
+              <w:rPr>
+                <w:rFonts w:hint="eastAsia"/>
+              </w:rPr>
+              <w:t xml:space="preserve">角度复合（原右侧三条通道波形已删除）；图</w:t>
+            </w:r>
+            <w:r>
+              <w:t xml:space="preserve"> F5 </w:t>
+            </w:r>
+            <w:r>
+              <w:rPr>
+                <w:rFonts w:hint="eastAsia"/>
+              </w:rPr>
+              <w:t xml:space="preserve">改为四幅横排（峰值幅度、幅度残差、−6</w:t>
+            </w:r>
+            <w:r>
+              <w:t xml:space="preserve"> dB </w:t>
+            </w:r>
+            <w:r>
+              <w:rPr>
+                <w:rFonts w:hint="eastAsia"/>
+              </w:rPr>
+              <w:t xml:space="preserve">横向宽度、宽度残差），删去原</w:t>
+            </w:r>
+            <w:r>
+              <w:t xml:space="preserve"> (c)(d) </w:t>
+            </w:r>
+            <w:r>
+              <w:rPr>
+                <w:rFonts w:hint="eastAsia"/>
+              </w:rPr>
+              <w:t xml:space="preserve">的横向/轴向剖面</w:t>
+            </w:r>
+          </w:p>
+        </w:tc>
+      </w:tr>
+      <w:tr>
+        <w:tc>
+          <w:tcPr/>
+          <w:p>
+            <w:pPr>
+              <w:pStyle w:val="Compact"/>
+            </w:pPr>
+            <w:r>
+              <w:t xml:space="preserve">v2.4</w:t>
+            </w:r>
+          </w:p>
+        </w:tc>
+        <w:tc>
+          <w:tcPr/>
+          <w:p>
+            <w:pPr>
+              <w:pStyle w:val="Compact"/>
+            </w:pPr>
+            <w:r>
+              <w:t xml:space="preserve">2026-10-28</w:t>
+            </w:r>
+          </w:p>
+        </w:tc>
+        <w:tc>
+          <w:tcPr/>
+          <w:p>
+            <w:pPr>
+              <w:pStyle w:val="Compact"/>
+            </w:pPr>
+            <w:r>
+              <w:rPr>
+                <w:rFonts w:hint="eastAsia"/>
+              </w:rPr>
+              <w:t xml:space="preserve">图</w:t>
+            </w:r>
+            <w:r>
+              <w:t xml:space="preserve"> F11 </w:t>
+            </w:r>
+            <w:r>
+              <w:rPr>
+                <w:rFonts w:hint="eastAsia"/>
+              </w:rPr>
+              <w:t xml:space="preserve">删除</w:t>
+            </w:r>
+            <w:r>
+              <w:t xml:space="preserve"> CNR </w:t>
+            </w:r>
+            <w:r>
+              <w:rPr>
+                <w:rFonts w:hint="eastAsia"/>
+              </w:rPr>
+              <w:t xml:space="preserve">柱状图（右幅），只保留对比度柱状图；CNR</w:t>
+            </w:r>
+            <w:r>
+              <w:t xml:space="preserve"> </w:t>
+            </w:r>
+            <w:r>
+              <w:rPr>
+                <w:rFonts w:hint="eastAsia"/>
+              </w:rPr>
+              <w:t xml:space="preserve">数值仍列于表</w:t>
+            </w:r>
+            <w:r>
+              <w:t xml:space="preserve"> </w:t>
+            </w:r>
+            <w:r>
+              <w:rPr>
+                <w:rFonts w:hint="eastAsia"/>
+              </w:rPr>
+              <w:t xml:space="preserve">T-C，删除理由与</w:t>
+            </w:r>
+            <w:r>
+              <w:t xml:space="preserve"> </w:t>
+            </w:r>
+            <m:oMath>
+              <m:r>
+                <m:t>1</m:t>
+              </m:r>
+              <m:r>
+                <m:rPr>
+                  <m:sty m:val="p"/>
+                </m:rPr>
+                <m:t>/</m:t>
+              </m:r>
+              <m:sSub>
+                <m:e>
+                  <m:r>
+                    <m:rPr>
+                      <m:sty m:val="p"/>
+                    </m:rPr>
+                    <m:t>C</m:t>
+                  </m:r>
+                  <m:r>
+                    <m:rPr>
+                      <m:sty m:val="p"/>
+                    </m:rPr>
+                    <m:t>V</m:t>
+                  </m:r>
+                </m:e>
+                <m:sub>
+                  <m:r>
+                    <m:t>o</m:t>
+                  </m:r>
+                  <m:r>
+                    <m:t>u</m:t>
+                  </m:r>
+                  <m:r>
+                    <m:t>t</m:t>
+                  </m:r>
+                </m:sub>
+              </m:sSub>
+            </m:oMath>
+            <w:r>
+              <w:t xml:space="preserve"> </w:t>
+            </w:r>
+            <w:r>
+              <w:rPr>
+                <w:rFonts w:hint="eastAsia"/>
+              </w:rPr>
+              <w:t xml:space="preserve">的上限分析记在附录</w:t>
+            </w:r>
+            <w:r>
+              <w:t xml:space="preserve"> </w:t>
+            </w:r>
+            <w:r>
+              <w:rPr>
+                <w:rFonts w:hint="eastAsia"/>
+              </w:rPr>
+              <w:t xml:space="preserve">B23；</w:t>
+            </w:r>
+            <w:r>
+              <w:rPr>
+                <w:rStyle w:val="VerbatimChar"/>
+              </w:rPr>
+              <w:t xml:space="preserve">make_figures</w:t>
+            </w:r>
+            <w:r>
+              <w:t xml:space="preserve"> </w:t>
+            </w:r>
+            <w:r>
+              <w:rPr>
+                <w:rFonts w:hint="eastAsia"/>
+              </w:rPr>
+              <w:t xml:space="preserve">的</w:t>
+            </w:r>
+            <w:r>
+              <w:t xml:space="preserve"> F11 </w:t>
+            </w:r>
+            <w:r>
+              <w:rPr>
+                <w:rFonts w:hint="eastAsia"/>
+              </w:rPr>
+              <w:t xml:space="preserve">段同步改为单幅</w:t>
+            </w:r>
+          </w:p>
+        </w:tc>
+      </w:tr>
+      <w:tr>
+        <w:tc>
+          <w:tcPr/>
+          <w:p>
+            <w:pPr>
+              <w:pStyle w:val="Compact"/>
+            </w:pPr>
+            <w:r>
+              <w:t xml:space="preserve">v2.5</w:t>
+            </w:r>
+          </w:p>
+        </w:tc>
+        <w:tc>
+          <w:tcPr/>
+          <w:p>
+            <w:pPr>
+              <w:pStyle w:val="Compact"/>
+            </w:pPr>
+            <w:r>
+              <w:t xml:space="preserve">2026-10-28</w:t>
+            </w:r>
+          </w:p>
+        </w:tc>
+        <w:tc>
+          <w:tcPr/>
+          <w:p>
+            <w:pPr>
+              <w:pStyle w:val="Compact"/>
+            </w:pPr>
+            <w:r>
+              <w:rPr>
+                <w:rFonts w:hint="eastAsia"/>
+              </w:rPr>
+              <w:t xml:space="preserve">报告改为四部分（实验目的</w:t>
+            </w:r>
+            <w:r>
+              <w:t xml:space="preserve"> / </w:t>
+            </w:r>
+            <w:r>
+              <w:rPr>
+                <w:rFonts w:hint="eastAsia"/>
+              </w:rPr>
+              <w:t xml:space="preserve">原理</w:t>
+            </w:r>
+            <w:r>
+              <w:t xml:space="preserve"> / </w:t>
+            </w:r>
+            <w:r>
+              <w:rPr>
+                <w:rFonts w:hint="eastAsia"/>
+              </w:rPr>
+              <w:t xml:space="preserve">实验参数</w:t>
+            </w:r>
+            <w:r>
+              <w:t xml:space="preserve"> / </w:t>
+            </w:r>
+            <w:r>
+              <w:rPr>
+                <w:rFonts w:hint="eastAsia"/>
+              </w:rPr>
+              <w:t xml:space="preserve">实验结果），10</w:t>
+            </w:r>
+            <w:r>
+              <w:t xml:space="preserve"> </w:t>
+            </w:r>
+            <w:r>
+              <w:rPr>
+                <w:rFonts w:hint="eastAsia"/>
+              </w:rPr>
+              <w:t xml:space="preserve">张图集中在结果部分，指标公式随所用图就近列出；按“结果不值得展示”删除信噪比（原</w:t>
+            </w:r>
+            <w:r>
+              <w:t xml:space="preserve"> </w:t>
+            </w:r>
+            <w:r>
+              <w:rPr>
+                <w:rFonts w:hint="eastAsia"/>
+              </w:rPr>
+              <w:t xml:space="preserve">4.4）、与论文</w:t>
+            </w:r>
+            <w:r>
+              <w:t xml:space="preserve"> Table I </w:t>
+            </w:r>
+            <w:r>
+              <w:rPr>
+                <w:rFonts w:hint="eastAsia"/>
+              </w:rPr>
+              <w:t xml:space="preserve">的对照（原</w:t>
+            </w:r>
+            <w:r>
+              <w:t xml:space="preserve"> </w:t>
+            </w:r>
+            <w:r>
+              <w:rPr>
+                <w:rFonts w:hint="eastAsia"/>
+              </w:rPr>
+              <w:t xml:space="preserve">4.5）与小结（原</w:t>
+            </w:r>
+            <w:r>
+              <w:t xml:space="preserve"> </w:t>
+            </w:r>
+            <w:r>
+              <w:rPr>
+                <w:rFonts w:hint="eastAsia"/>
+              </w:rPr>
+              <w:t xml:space="preserve">4.6），正文止于图</w:t>
+            </w:r>
+            <w:r>
+              <w:t xml:space="preserve"> F11 </w:t>
+            </w:r>
+            <w:r>
+              <w:rPr>
+                <w:rFonts w:hint="eastAsia"/>
+              </w:rPr>
+              <w:t xml:space="preserve">的</w:t>
+            </w:r>
+            <w:r>
+              <w:t xml:space="preserve"> CNR </w:t>
+            </w:r>
+            <w:r>
+              <w:rPr>
+                <w:rFonts w:hint="eastAsia"/>
+              </w:rPr>
+              <w:t xml:space="preserve">说明。图</w:t>
+            </w:r>
+            <w:r>
+              <w:t xml:space="preserve"> F12 </w:t>
+            </w:r>
+            <w:r>
+              <w:rPr>
+                <w:rFonts w:hint="eastAsia"/>
+              </w:rPr>
+              <w:t xml:space="preserve">与表</w:t>
+            </w:r>
+            <w:r>
+              <w:t xml:space="preserve"> T-D </w:t>
+            </w:r>
+            <w:r>
+              <w:rPr>
+                <w:rFonts w:hint="eastAsia"/>
+              </w:rPr>
+              <w:t xml:space="preserve">仍由脚本生成并留在</w:t>
+            </w:r>
+            <w:r>
+              <w:t xml:space="preserve"> </w:t>
+            </w:r>
+            <w:r>
+              <w:rPr>
+                <w:rStyle w:val="VerbatimChar"/>
+              </w:rPr>
+              <w:t xml:space="preserve">data/res/</w:t>
+            </w:r>
+            <w:r>
+              <w:rPr>
+                <w:rFonts w:hint="eastAsia"/>
+              </w:rPr>
+              <w:t xml:space="preserve">，只是不进报告</w:t>
+            </w:r>
+          </w:p>
+        </w:tc>
+      </w:tr>
+      <w:tr>
+        <w:tc>
+          <w:tcPr/>
+          <w:p>
+            <w:pPr>
+              <w:pStyle w:val="Compact"/>
+            </w:pPr>
+            <w:r>
+              <w:t xml:space="preserve">v2.6</w:t>
+            </w:r>
+          </w:p>
+        </w:tc>
+        <w:tc>
+          <w:tcPr/>
+          <w:p>
+            <w:pPr>
+              <w:pStyle w:val="Compact"/>
+            </w:pPr>
+            <w:r>
+              <w:t xml:space="preserve">2026-10-28</w:t>
+            </w:r>
+          </w:p>
+        </w:tc>
+        <w:tc>
+          <w:tcPr/>
+          <w:p>
+            <w:pPr>
+              <w:pStyle w:val="Compact"/>
+            </w:pPr>
+            <w:r>
+              <w:rPr>
+                <w:rFonts w:hint="eastAsia"/>
+              </w:rPr>
+              <w:t xml:space="preserve">报告再删表</w:t>
+            </w:r>
+            <w:r>
+              <w:t xml:space="preserve"> T-C </w:t>
+            </w:r>
+            <w:r>
+              <w:rPr>
+                <w:rFonts w:hint="eastAsia"/>
+              </w:rPr>
+              <w:t xml:space="preserve">与全部</w:t>
+            </w:r>
+            <w:r>
+              <w:t xml:space="preserve"> CNR </w:t>
+            </w:r>
+            <w:r>
+              <w:rPr>
+                <w:rFonts w:hint="eastAsia"/>
+              </w:rPr>
+              <w:t xml:space="preserve">内容（定义式、σ</w:t>
+            </w:r>
+            <w:r>
+              <w:t xml:space="preserve"> </w:t>
+            </w:r>
+            <w:r>
+              <w:rPr>
+                <w:rFonts w:hint="eastAsia"/>
+              </w:rPr>
+              <w:t xml:space="preserve">说明、CNR</w:t>
+            </w:r>
+            <w:r>
+              <w:t xml:space="preserve"> </w:t>
+            </w:r>
+            <w:r>
+              <w:rPr>
+                <w:rFonts w:hint="eastAsia"/>
+              </w:rPr>
+              <w:t xml:space="preserve">讨论段），囊肿部分只报对比度</w:t>
+            </w:r>
+            <w:r>
+              <w:t xml:space="preserve"> </w:t>
+            </w:r>
+            <m:oMath>
+              <m:r>
+                <m:rPr>
+                  <m:sty m:val="p"/>
+                </m:rPr>
+                <m:t>|</m:t>
+              </m:r>
+              <m:r>
+                <m:t>C</m:t>
+              </m:r>
+              <m:r>
+                <m:rPr>
+                  <m:sty m:val="p"/>
+                </m:rPr>
+                <m:t>|</m:t>
+              </m:r>
+            </m:oMath>
+            <w:r>
+              <w:rPr>
+                <w:rFonts w:hint="eastAsia"/>
+              </w:rPr>
+              <w:t xml:space="preserve">，均值</w:t>
+            </w:r>
+            <w:r>
+              <w:t xml:space="preserve"> ± </w:t>
+            </w:r>
+            <w:r>
+              <w:rPr>
+                <w:rFonts w:hint="eastAsia"/>
+              </w:rPr>
+              <w:t xml:space="preserve">标准差改在正文列出；正文因此止于图</w:t>
+            </w:r>
+            <w:r>
+              <w:t xml:space="preserve"> F11 </w:t>
+            </w:r>
+            <w:r>
+              <w:rPr>
+                <w:rFonts w:hint="eastAsia"/>
+              </w:rPr>
+              <w:t xml:space="preserve">的四条结果。CNR</w:t>
+            </w:r>
+            <w:r>
+              <w:t xml:space="preserve"> </w:t>
+            </w:r>
+            <w:r>
+              <w:rPr>
+                <w:rFonts w:hint="eastAsia"/>
+              </w:rPr>
+              <w:t xml:space="preserve">的定量分析（</w:t>
+            </w:r>
+            <m:oMath>
+              <m:r>
+                <m:t>1</m:t>
+              </m:r>
+              <m:r>
+                <m:rPr>
+                  <m:sty m:val="p"/>
+                </m:rPr>
+                <m:t>/</m:t>
+              </m:r>
+              <m:sSub>
+                <m:e>
+                  <m:r>
+                    <m:rPr>
+                      <m:sty m:val="p"/>
+                    </m:rPr>
+                    <m:t>C</m:t>
+                  </m:r>
+                  <m:r>
+                    <m:rPr>
+                      <m:sty m:val="p"/>
+                    </m:rPr>
+                    <m:t>V</m:t>
+                  </m:r>
+                </m:e>
+                <m:sub>
+                  <m:r>
+                    <m:t>o</m:t>
+                  </m:r>
+                  <m:r>
+                    <m:t>u</m:t>
+                  </m:r>
+                  <m:r>
+                    <m:t>t</m:t>
+                  </m:r>
+                </m:sub>
+              </m:sSub>
+            </m:oMath>
+            <w:r>
+              <w:t xml:space="preserve"> </w:t>
+            </w:r>
+            <w:r>
+              <w:rPr>
+                <w:rFonts w:hint="eastAsia"/>
+              </w:rPr>
+              <w:t xml:space="preserve">上限）保留在附录</w:t>
+            </w:r>
+            <w:r>
+              <w:t xml:space="preserve"> B23 </w:t>
+            </w:r>
+            <w:r>
+              <w:rPr>
+                <w:rFonts w:hint="eastAsia"/>
+              </w:rPr>
+              <w:t xml:space="preserve">作为归档，</w:t>
+            </w:r>
+            <w:r>
+              <w:rPr>
+                <w:rStyle w:val="VerbatimChar"/>
+              </w:rPr>
+              <w:t xml:space="preserve">metrics_contrast.m</w:t>
+            </w:r>
+            <w:r>
+              <w:t xml:space="preserve"> </w:t>
+            </w:r>
+            <w:r>
+              <w:rPr>
+                <w:rFonts w:hint="eastAsia"/>
+              </w:rPr>
+              <w:t xml:space="preserve">仍计算</w:t>
+            </w:r>
+            <w:r>
+              <w:t xml:space="preserve"> CNR</w:t>
+            </w:r>
+          </w:p>
+        </w:tc>
+      </w:tr>
+      <w:tr>
+        <w:tc>
+          <w:tcPr/>
+          <w:p>
+            <w:pPr>
+              <w:pStyle w:val="Compact"/>
+            </w:pPr>
+            <w:r>
+              <w:t xml:space="preserve">v2.7</w:t>
+            </w:r>
+          </w:p>
+        </w:tc>
+        <w:tc>
+          <w:tcPr/>
+          <w:p>
+            <w:pPr>
+              <w:pStyle w:val="Compact"/>
+            </w:pPr>
+            <w:r>
+              <w:t xml:space="preserve">2026-10-28</w:t>
+            </w:r>
+          </w:p>
+        </w:tc>
+        <w:tc>
+          <w:tcPr/>
+          <w:p>
+            <w:pPr>
+              <w:pStyle w:val="Compact"/>
+            </w:pPr>
+            <w:r>
+              <w:rPr>
+                <w:rFonts w:hint="eastAsia"/>
+              </w:rPr>
+              <w:t xml:space="preserve">报告原理部分把传统逐线聚焦前置为</w:t>
+            </w:r>
+            <w:r>
+              <w:t xml:space="preserve"> </w:t>
+            </w:r>
+            <w:r>
+              <w:rPr>
+                <w:rFonts w:hint="eastAsia"/>
+              </w:rPr>
+              <w:t xml:space="preserve">2.1（平面波</w:t>
+            </w:r>
+            <w:r>
+              <w:t xml:space="preserve"> DAS </w:t>
+            </w:r>
+            <w:r>
+              <w:rPr>
+                <w:rFonts w:hint="eastAsia"/>
+              </w:rPr>
+              <w:t xml:space="preserve">与相干复合顺延为</w:t>
+            </w:r>
+            <w:r>
+              <w:t xml:space="preserve"> </w:t>
+            </w:r>
+            <w:r>
+              <w:rPr>
+                <w:rFonts w:hint="eastAsia"/>
+              </w:rPr>
+              <w:t xml:space="preserve">2.2/2.3）；删除原</w:t>
+            </w:r>
+            <w:r>
+              <w:t xml:space="preserve"> 3.3 </w:t>
+            </w:r>
+            <w:r>
+              <w:rPr>
+                <w:rFonts w:hint="eastAsia"/>
+              </w:rPr>
+              <w:t xml:space="preserve">体模、3.4</w:t>
+            </w:r>
+            <w:r>
+              <w:t xml:space="preserve"> </w:t>
+            </w:r>
+            <w:r>
+              <w:rPr>
+                <w:rFonts w:hint="eastAsia"/>
+              </w:rPr>
+              <w:t xml:space="preserve">角度序列与噪声、3.5</w:t>
+            </w:r>
+            <w:r>
+              <w:t xml:space="preserve"> </w:t>
+            </w:r>
+            <w:r>
+              <w:rPr>
+                <w:rFonts w:hint="eastAsia"/>
+              </w:rPr>
+              <w:t xml:space="preserve">与论文参数差异、3.6</w:t>
+            </w:r>
+            <w:r>
+              <w:t xml:space="preserve"> E0 </w:t>
+            </w:r>
+            <w:r>
+              <w:rPr>
+                <w:rFonts w:hint="eastAsia"/>
+              </w:rPr>
+              <w:t xml:space="preserve">核对（体模改为在结果小节就地定义，噪声只在含噪对比度处一句话说明）；结果总览新增</w:t>
+            </w:r>
+            <w:r>
+              <w:t xml:space="preserve"> PW/C11 </w:t>
+            </w:r>
+            <w:r>
+              <w:rPr>
+                <w:rFonts w:hint="eastAsia"/>
+              </w:rPr>
+              <w:t xml:space="preserve">采集帧率的推导式</w:t>
+            </w:r>
+          </w:p>
+        </w:tc>
+      </w:tr>
+      <w:tr>
+        <w:tc>
+          <w:tcPr/>
+          <w:p>
+            <w:pPr>
+              <w:pStyle w:val="Compact"/>
+            </w:pPr>
+            <w:r>
+              <w:t xml:space="preserve">v2.8</w:t>
+            </w:r>
+          </w:p>
+        </w:tc>
+        <w:tc>
+          <w:tcPr/>
+          <w:p>
+            <w:pPr>
+              <w:pStyle w:val="Compact"/>
+            </w:pPr>
+            <w:r>
+              <w:t xml:space="preserve">2026-10-28</w:t>
+            </w:r>
+          </w:p>
+        </w:tc>
+        <w:tc>
+          <w:tcPr/>
+          <w:p>
+            <w:pPr>
+              <w:pStyle w:val="Compact"/>
+            </w:pPr>
+            <w:r>
+              <w:rPr>
+                <w:rFonts w:hint="eastAsia"/>
+              </w:rPr>
+              <w:t xml:space="preserve">图</w:t>
+            </w:r>
+            <w:r>
+              <w:t xml:space="preserve"> F10 </w:t>
+            </w:r>
+            <w:r>
+              <w:rPr>
+                <w:rFonts w:hint="eastAsia"/>
+              </w:rPr>
+              <w:t xml:space="preserve">换数据源：不再用</w:t>
+            </w:r>
+            <w:r>
+              <w:t xml:space="preserve"> P3 </w:t>
+            </w:r>
+            <w:r>
+              <w:rPr>
+                <w:rFonts w:hint="eastAsia"/>
+              </w:rPr>
+              <w:t xml:space="preserve">的</w:t>
+            </w:r>
+            <w:r>
+              <w:t xml:space="preserve"> 6 </w:t>
+            </w:r>
+            <w:r>
+              <w:rPr>
+                <w:rFonts w:hint="eastAsia"/>
+              </w:rPr>
+              <w:t xml:space="preserve">个轴上散射子，改为“轴上逐点单散射子”实验（</w:t>
+            </w:r>
+            <w:r>
+              <w:rPr>
+                <w:rStyle w:val="VerbatimChar"/>
+              </w:rPr>
+              <w:t xml:space="preserve">src/psf_axis.m</w:t>
+            </w:r>
+            <w:r>
+              <w:t xml:space="preserve"> </w:t>
+            </w:r>
+            <w:r>
+              <w:t xml:space="preserve">+</w:t>
+            </w:r>
+            <w:r>
+              <w:t xml:space="preserve"> </w:t>
+            </w:r>
+            <w:r>
+              <w:rPr>
+                <w:rStyle w:val="VerbatimChar"/>
+              </w:rPr>
+              <w:t xml:space="preserve">run/run_axisres.m</w:t>
+            </w:r>
+            <w:r>
+              <w:rPr>
+                <w:rFonts w:hint="eastAsia"/>
+              </w:rPr>
+              <w:t xml:space="preserve">，数据存</w:t>
+            </w:r>
+            <w:r>
+              <w:t xml:space="preserve"> </w:t>
+            </w:r>
+            <w:r>
+              <w:rPr>
+                <w:rStyle w:val="VerbatimChar"/>
+              </w:rPr>
+              <w:t xml:space="preserve">data/res/axisres.mat</w:t>
+            </w:r>
+            <w:r>
+              <w:rPr>
+                <w:rFonts w:hint="eastAsia"/>
+              </w:rPr>
+              <w:t xml:space="preserve">）——</w:t>
+            </w:r>
+            <m:oMath>
+              <m:r>
+                <m:t>x</m:t>
+              </m:r>
+              <m:r>
+                <m:rPr>
+                  <m:sty m:val="p"/>
+                </m:rPr>
+                <m:t>=</m:t>
+              </m:r>
+              <m:r>
+                <m:t>0</m:t>
+              </m:r>
+            </m:oMath>
+            <w:r>
+              <w:t xml:space="preserve">、</w:t>
+            </w:r>
+            <m:oMath>
+              <m:r>
+                <m:t>z</m:t>
+              </m:r>
+              <m:r>
+                <m:rPr>
+                  <m:sty m:val="p"/>
+                </m:rPr>
+                <m:t>=</m:t>
+              </m:r>
+              <m:r>
+                <m:t>10</m:t>
+              </m:r>
+            </m:oMath>
+            <w:r>
+              <w:t xml:space="preserve">–60 mm </w:t>
+            </w:r>
+            <w:r>
+              <w:rPr>
+                <w:rFonts w:hint="eastAsia"/>
+              </w:rPr>
+              <w:t xml:space="preserve">每</w:t>
+            </w:r>
+            <w:r>
+              <w:t xml:space="preserve"> 2 mm </w:t>
+            </w:r>
+            <w:r>
+              <w:rPr>
+                <w:rFonts w:hint="eastAsia"/>
+              </w:rPr>
+              <w:t xml:space="preserve">一个散射子，一次只放一个、放一个扫一遍，共</w:t>
+            </w:r>
+            <w:r>
+              <w:t xml:space="preserve"> 26 </w:t>
+            </w:r>
+            <w:r>
+              <w:rPr>
+                <w:rFonts w:hint="eastAsia"/>
+              </w:rPr>
+              <w:t xml:space="preserve">点；聚焦另做</w:t>
+            </w:r>
+            <w:r>
+              <w:t xml:space="preserve"> 0.5 mm </w:t>
+            </w:r>
+            <w:r>
+              <w:rPr>
+                <w:rFonts w:hint="eastAsia"/>
+              </w:rPr>
+              <w:t xml:space="preserve">细扫（101</w:t>
+            </w:r>
+            <w:r>
+              <w:t xml:space="preserve"> </w:t>
+            </w:r>
+            <w:r>
+              <w:rPr>
+                <w:rFonts w:hint="eastAsia"/>
+              </w:rPr>
+              <w:t xml:space="preserve">点，图中浅灰细线）。该实验在表</w:t>
+            </w:r>
+            <w:r>
+              <w:t xml:space="preserve"> T-B </w:t>
+            </w:r>
+            <w:r>
+              <w:rPr>
+                <w:rFonts w:hint="eastAsia"/>
+              </w:rPr>
+              <w:t xml:space="preserve">的六个深度上复现旧读数（0.840/0.898/0.645/0.825/0.859/0.795</w:t>
+            </w:r>
+            <w:r>
+              <w:t xml:space="preserve"> </w:t>
+            </w:r>
+            <w:r>
+              <w:rPr>
+                <w:rFonts w:hint="eastAsia"/>
+              </w:rPr>
+              <w:t xml:space="preserve">对</w:t>
+            </w:r>
+            <w:r>
+              <w:t xml:space="preserve"> </w:t>
+            </w:r>
+            <w:r>
+              <w:rPr>
+                <w:rFonts w:hint="eastAsia"/>
+              </w:rPr>
+              <w:t xml:space="preserve">0.84/0.90/0.65/0.83/0.86/0.80），并因此发现焦区约</w:t>
+            </w:r>
+            <w:r>
+              <w:t xml:space="preserve"> 1.8 mm </w:t>
+            </w:r>
+            <w:r>
+              <w:rPr>
+                <w:rFonts w:hint="eastAsia"/>
+              </w:rPr>
+              <w:t xml:space="preserve">周期的轴向纹波（矩形发射孔径的边缘波，轴上峰值声压起伏</w:t>
+            </w:r>
+            <w:r>
+              <w:t xml:space="preserve"> 4–6 </w:t>
+            </w:r>
+            <w:r>
+              <w:rPr>
+                <w:rFonts w:hint="eastAsia"/>
+              </w:rPr>
+              <w:t xml:space="preserve">dB）。报告</w:t>
+            </w:r>
+            <w:r>
+              <w:t xml:space="preserve"> 4.2 </w:t>
+            </w:r>
+            <w:r>
+              <w:rPr>
+                <w:rFonts w:hint="eastAsia"/>
+              </w:rPr>
+              <w:t xml:space="preserve">节、图号表</w:t>
+            </w:r>
+            <w:r>
+              <w:t xml:space="preserve"> F10 </w:t>
+            </w:r>
+            <w:r>
+              <w:rPr>
+                <w:rFonts w:hint="eastAsia"/>
+              </w:rPr>
+              <w:t xml:space="preserve">行与</w:t>
+            </w:r>
+            <w:r>
+              <w:t xml:space="preserve"> E4 </w:t>
+            </w:r>
+            <w:r>
+              <w:rPr>
+                <w:rFonts w:hint="eastAsia"/>
+              </w:rPr>
+              <w:t xml:space="preserve">条目同步；</w:t>
+            </w:r>
+            <w:r>
+              <w:rPr>
+                <w:rStyle w:val="VerbatimChar"/>
+              </w:rPr>
+              <w:t xml:space="preserve">run_refresh</w:t>
+            </w:r>
+            <w:r>
+              <w:t xml:space="preserve">/</w:t>
+            </w:r>
+            <w:r>
+              <w:rPr>
+                <w:rStyle w:val="VerbatimChar"/>
+              </w:rPr>
+              <w:t xml:space="preserve">run_tail</w:t>
+            </w:r>
+            <w:r>
+              <w:t xml:space="preserve"> </w:t>
+            </w:r>
+            <w:r>
+              <w:rPr>
+                <w:rFonts w:hint="eastAsia"/>
+              </w:rPr>
+              <w:t xml:space="preserve">增加对该实验的调用与指纹缓存</w:t>
             </w:r>
           </w:p>
         </w:tc>

</xml_diff>